<commit_message>
Added Resources section to assignment documents for Milestone 5
</commit_message>
<xml_diff>
--- a/00_Project_Management/assignments/Milestone_5_Algorithms/Team1/M5_Pseudocode_Algorithms_Assignments_ Team1.docx
+++ b/00_Project_Management/assignments/Milestone_5_Algorithms/Team1/M5_Pseudocode_Algorithms_Assignments_ Team1.docx
@@ -940,6 +940,622 @@
       <w:pPr>
         <w:pStyle w:val="GitHubProcesses"/>
         <w:rPr>
+          <w:sz w:val="36"/>
+          <w:szCs w:val="36"/>
+        </w:rPr>
+      </w:pPr>
+      <w:r>
+        <w:rPr>
+          <w:sz w:val="36"/>
+          <w:szCs w:val="36"/>
+        </w:rPr>
+        <w:t xml:space="preserve">Figure 1.2 &amp; 1.3 — Web Client </w:t>
+      </w:r>
+      <w:r>
+        <w:rPr>
+          <w:sz w:val="36"/>
+          <w:szCs w:val="36"/>
+        </w:rPr>
+        <w:t>&amp;</w:t>
+      </w:r>
+      <w:r>
+        <w:rPr>
+          <w:sz w:val="36"/>
+          <w:szCs w:val="36"/>
+        </w:rPr>
+        <w:t xml:space="preserve"> Mobile Client</w:t>
+      </w:r>
+    </w:p>
+    <w:p>
+      <w:pPr>
+        <w:pStyle w:val="Sub-Info"/>
+      </w:pPr>
+      <w:r>
+        <w:t>Required List (15 Algorithms)</w:t>
+      </w:r>
+    </w:p>
+    <w:p>
+      <w:pPr>
+        <w:pStyle w:val="ListParagraph"/>
+        <w:numPr>
+          <w:ilvl w:val="0"/>
+          <w:numId w:val="1"/>
+        </w:numPr>
+      </w:pPr>
+      <w:r>
+        <w:t xml:space="preserve">1.2.1 &amp; 1.3.1-ALG </w:t>
+      </w:r>
+      <w:proofErr w:type="spellStart"/>
+      <w:proofErr w:type="gramStart"/>
+      <w:r>
+        <w:t>updateView</w:t>
+      </w:r>
+      <w:proofErr w:type="spellEnd"/>
+      <w:r>
+        <w:t>(</w:t>
+      </w:r>
+      <w:proofErr w:type="gramEnd"/>
+      <w:r>
+        <w:t>) Algorithm</w:t>
+      </w:r>
+    </w:p>
+    <w:p>
+      <w:pPr>
+        <w:pStyle w:val="ListParagraph"/>
+        <w:numPr>
+          <w:ilvl w:val="0"/>
+          <w:numId w:val="1"/>
+        </w:numPr>
+      </w:pPr>
+      <w:r>
+        <w:t xml:space="preserve">1.2.1 &amp; 1.3.1-ALG </w:t>
+      </w:r>
+      <w:proofErr w:type="spellStart"/>
+      <w:proofErr w:type="gramStart"/>
+      <w:r>
+        <w:t>selectNavigationTarget</w:t>
+      </w:r>
+      <w:proofErr w:type="spellEnd"/>
+      <w:r>
+        <w:t>(</w:t>
+      </w:r>
+      <w:proofErr w:type="gramEnd"/>
+      <w:r>
+        <w:t>) Algorithm</w:t>
+      </w:r>
+    </w:p>
+    <w:p>
+      <w:pPr>
+        <w:pStyle w:val="ListParagraph"/>
+        <w:numPr>
+          <w:ilvl w:val="0"/>
+          <w:numId w:val="1"/>
+        </w:numPr>
+      </w:pPr>
+      <w:r>
+        <w:t xml:space="preserve">1.2.2 &amp; 1.3.2-ALG </w:t>
+      </w:r>
+      <w:proofErr w:type="spellStart"/>
+      <w:proofErr w:type="gramStart"/>
+      <w:r>
+        <w:t>onInit</w:t>
+      </w:r>
+      <w:proofErr w:type="spellEnd"/>
+      <w:r>
+        <w:t>(</w:t>
+      </w:r>
+      <w:proofErr w:type="gramEnd"/>
+      <w:r>
+        <w:t>) Algorithm</w:t>
+      </w:r>
+    </w:p>
+    <w:p>
+      <w:pPr>
+        <w:pStyle w:val="ListParagraph"/>
+        <w:numPr>
+          <w:ilvl w:val="0"/>
+          <w:numId w:val="1"/>
+        </w:numPr>
+      </w:pPr>
+      <w:r>
+        <w:t xml:space="preserve">1.2.2 &amp; 1.3.2-ALG </w:t>
+      </w:r>
+      <w:proofErr w:type="spellStart"/>
+      <w:proofErr w:type="gramStart"/>
+      <w:r>
+        <w:t>renderSelectedView</w:t>
+      </w:r>
+      <w:proofErr w:type="spellEnd"/>
+      <w:r>
+        <w:t>(</w:t>
+      </w:r>
+      <w:proofErr w:type="gramEnd"/>
+      <w:r>
+        <w:t>) Algorithm</w:t>
+      </w:r>
+    </w:p>
+    <w:p>
+      <w:pPr>
+        <w:pStyle w:val="ListParagraph"/>
+        <w:numPr>
+          <w:ilvl w:val="0"/>
+          <w:numId w:val="1"/>
+        </w:numPr>
+      </w:pPr>
+      <w:r>
+        <w:t xml:space="preserve">1.2.2 &amp; 1.3.2-ALG </w:t>
+      </w:r>
+      <w:proofErr w:type="gramStart"/>
+      <w:r>
+        <w:t>render(</w:t>
+      </w:r>
+      <w:proofErr w:type="gramEnd"/>
+      <w:r>
+        <w:t>) Algorithm</w:t>
+      </w:r>
+    </w:p>
+    <w:p>
+      <w:pPr>
+        <w:pStyle w:val="ListParagraph"/>
+        <w:numPr>
+          <w:ilvl w:val="0"/>
+          <w:numId w:val="1"/>
+        </w:numPr>
+      </w:pPr>
+      <w:r>
+        <w:t xml:space="preserve">1.2.3 &amp; 1.3.3-ALG </w:t>
+      </w:r>
+      <w:proofErr w:type="spellStart"/>
+      <w:proofErr w:type="gramStart"/>
+      <w:r>
+        <w:t>submitForm</w:t>
+      </w:r>
+      <w:proofErr w:type="spellEnd"/>
+      <w:r>
+        <w:t>(</w:t>
+      </w:r>
+      <w:proofErr w:type="gramEnd"/>
+      <w:r>
+        <w:t>) Algorithm</w:t>
+      </w:r>
+    </w:p>
+    <w:p>
+      <w:pPr>
+        <w:pStyle w:val="ListParagraph"/>
+        <w:numPr>
+          <w:ilvl w:val="0"/>
+          <w:numId w:val="1"/>
+        </w:numPr>
+      </w:pPr>
+      <w:r>
+        <w:t xml:space="preserve">1.2.3 &amp; 1.3.3-ALG </w:t>
+      </w:r>
+      <w:proofErr w:type="spellStart"/>
+      <w:proofErr w:type="gramStart"/>
+      <w:r>
+        <w:t>validateInputs</w:t>
+      </w:r>
+      <w:proofErr w:type="spellEnd"/>
+      <w:r>
+        <w:t>(</w:t>
+      </w:r>
+      <w:proofErr w:type="gramEnd"/>
+      <w:r>
+        <w:t>) Algorithm</w:t>
+      </w:r>
+    </w:p>
+    <w:p>
+      <w:pPr>
+        <w:pStyle w:val="ListParagraph"/>
+        <w:numPr>
+          <w:ilvl w:val="0"/>
+          <w:numId w:val="1"/>
+        </w:numPr>
+      </w:pPr>
+      <w:r>
+        <w:t xml:space="preserve">1.2.3 &amp; 1.3.3-ALG </w:t>
+      </w:r>
+      <w:proofErr w:type="spellStart"/>
+      <w:proofErr w:type="gramStart"/>
+      <w:r>
+        <w:t>checkRequiredFields</w:t>
+      </w:r>
+      <w:proofErr w:type="spellEnd"/>
+      <w:r>
+        <w:t>(</w:t>
+      </w:r>
+      <w:proofErr w:type="gramEnd"/>
+      <w:r>
+        <w:t>) Algorithm</w:t>
+      </w:r>
+    </w:p>
+    <w:p>
+      <w:pPr>
+        <w:pStyle w:val="ListParagraph"/>
+        <w:numPr>
+          <w:ilvl w:val="0"/>
+          <w:numId w:val="1"/>
+        </w:numPr>
+      </w:pPr>
+      <w:r>
+        <w:t xml:space="preserve">1.2.3 &amp; 1.3.3-ALG </w:t>
+      </w:r>
+      <w:proofErr w:type="spellStart"/>
+      <w:proofErr w:type="gramStart"/>
+      <w:r>
+        <w:t>buildPayload</w:t>
+      </w:r>
+      <w:proofErr w:type="spellEnd"/>
+      <w:r>
+        <w:t>(</w:t>
+      </w:r>
+      <w:proofErr w:type="gramEnd"/>
+      <w:r>
+        <w:t>) Algorithm</w:t>
+      </w:r>
+    </w:p>
+    <w:p>
+      <w:pPr>
+        <w:pStyle w:val="ListParagraph"/>
+        <w:numPr>
+          <w:ilvl w:val="0"/>
+          <w:numId w:val="1"/>
+        </w:numPr>
+      </w:pPr>
+      <w:r>
+        <w:t xml:space="preserve">1.2.3 &amp; 1.3.3-ALG </w:t>
+      </w:r>
+      <w:proofErr w:type="spellStart"/>
+      <w:proofErr w:type="gramStart"/>
+      <w:r>
+        <w:t>displayValidationFeedback</w:t>
+      </w:r>
+      <w:proofErr w:type="spellEnd"/>
+      <w:r>
+        <w:t>(</w:t>
+      </w:r>
+      <w:proofErr w:type="gramEnd"/>
+      <w:r>
+        <w:t>) Algorithm</w:t>
+      </w:r>
+    </w:p>
+    <w:p>
+      <w:pPr>
+        <w:pStyle w:val="ListParagraph"/>
+        <w:numPr>
+          <w:ilvl w:val="0"/>
+          <w:numId w:val="1"/>
+        </w:numPr>
+      </w:pPr>
+      <w:r>
+        <w:t xml:space="preserve">1.2.4 &amp; 1.3.4-ALG </w:t>
+      </w:r>
+      <w:proofErr w:type="spellStart"/>
+      <w:proofErr w:type="gramStart"/>
+      <w:r>
+        <w:t>updateClientState</w:t>
+      </w:r>
+      <w:proofErr w:type="spellEnd"/>
+      <w:r>
+        <w:t>(</w:t>
+      </w:r>
+      <w:proofErr w:type="gramEnd"/>
+      <w:r>
+        <w:t>) Algorithm</w:t>
+      </w:r>
+    </w:p>
+    <w:p>
+      <w:pPr>
+        <w:pStyle w:val="ListParagraph"/>
+        <w:numPr>
+          <w:ilvl w:val="0"/>
+          <w:numId w:val="1"/>
+        </w:numPr>
+      </w:pPr>
+      <w:r>
+        <w:t xml:space="preserve">1.2.4 &amp; 1.3.4-ALG </w:t>
+      </w:r>
+      <w:proofErr w:type="spellStart"/>
+      <w:proofErr w:type="gramStart"/>
+      <w:r>
+        <w:t>DynamicUI</w:t>
+      </w:r>
+      <w:proofErr w:type="spellEnd"/>
+      <w:r>
+        <w:t>(</w:t>
+      </w:r>
+      <w:proofErr w:type="gramEnd"/>
+      <w:r>
+        <w:t>) Algorithm</w:t>
+      </w:r>
+    </w:p>
+    <w:p>
+      <w:pPr>
+        <w:pStyle w:val="ListParagraph"/>
+        <w:numPr>
+          <w:ilvl w:val="0"/>
+          <w:numId w:val="1"/>
+        </w:numPr>
+      </w:pPr>
+      <w:r>
+        <w:t xml:space="preserve">1.2.4 &amp; 1.3.4-ALG </w:t>
+      </w:r>
+      <w:proofErr w:type="spellStart"/>
+      <w:proofErr w:type="gramStart"/>
+      <w:r>
+        <w:t>updateAccessibility</w:t>
+      </w:r>
+      <w:proofErr w:type="spellEnd"/>
+      <w:r>
+        <w:t>(</w:t>
+      </w:r>
+      <w:proofErr w:type="gramEnd"/>
+      <w:r>
+        <w:t>) Algorithm</w:t>
+      </w:r>
+    </w:p>
+    <w:p>
+      <w:pPr>
+        <w:pStyle w:val="ListParagraph"/>
+        <w:numPr>
+          <w:ilvl w:val="0"/>
+          <w:numId w:val="1"/>
+        </w:numPr>
+      </w:pPr>
+      <w:r>
+        <w:t xml:space="preserve">1.2.5 &amp; 1.3.5-ALG </w:t>
+      </w:r>
+      <w:proofErr w:type="spellStart"/>
+      <w:proofErr w:type="gramStart"/>
+      <w:r>
+        <w:t>sendAPIRequest</w:t>
+      </w:r>
+      <w:proofErr w:type="spellEnd"/>
+      <w:r>
+        <w:t>(</w:t>
+      </w:r>
+      <w:proofErr w:type="gramEnd"/>
+      <w:r>
+        <w:t>) Algorithm</w:t>
+      </w:r>
+    </w:p>
+    <w:p>
+      <w:pPr>
+        <w:pStyle w:val="ListParagraph"/>
+        <w:numPr>
+          <w:ilvl w:val="0"/>
+          <w:numId w:val="1"/>
+        </w:numPr>
+      </w:pPr>
+      <w:r>
+        <w:t xml:space="preserve">1.2.5 &amp; 1.3.5-ALG </w:t>
+      </w:r>
+      <w:proofErr w:type="spellStart"/>
+      <w:proofErr w:type="gramStart"/>
+      <w:r>
+        <w:t>ResponseParser</w:t>
+      </w:r>
+      <w:proofErr w:type="spellEnd"/>
+      <w:r>
+        <w:t>(</w:t>
+      </w:r>
+      <w:proofErr w:type="gramEnd"/>
+      <w:r>
+        <w:t>) Algorithm</w:t>
+      </w:r>
+    </w:p>
+    <w:p>
+      <w:pPr>
+        <w:pStyle w:val="GitHubProcesses"/>
+        <w:rPr>
+          <w:u w:val="none"/>
+        </w:rPr>
+      </w:pPr>
+      <w:r>
+        <w:rPr>
+          <w:u w:val="none"/>
+        </w:rPr>
+        <w:lastRenderedPageBreak/>
+        <w:t>Resources:</w:t>
+      </w:r>
+    </w:p>
+    <w:p>
+      <w:r>
+        <w:rPr>
+          <w:b/>
+          <w:bCs/>
+        </w:rPr>
+        <w:t xml:space="preserve">#1 </w:t>
+      </w:r>
+      <w:proofErr w:type="spellStart"/>
+      <w:r>
+        <w:rPr>
+          <w:b/>
+          <w:bCs/>
+        </w:rPr>
+        <w:t>Drawio</w:t>
+      </w:r>
+      <w:proofErr w:type="spellEnd"/>
+      <w:r>
+        <w:rPr>
+          <w:b/>
+          <w:bCs/>
+        </w:rPr>
+        <w:t xml:space="preserve"> Template:</w:t>
+      </w:r>
+      <w:r>
+        <w:t xml:space="preserve"> </w:t>
+      </w:r>
+      <w:r>
+        <w:t>"CareerBound-SDD\01_Standards\Templates\Milestone_5_Algorithms\M5_Pseudocode_Template.drawio.png"</w:t>
+      </w:r>
+    </w:p>
+    <w:p>
+      <w:r>
+        <w:rPr>
+          <w:b/>
+          <w:bCs/>
+        </w:rPr>
+        <w:t>#2</w:t>
+      </w:r>
+      <w:r>
+        <w:rPr>
+          <w:b/>
+          <w:bCs/>
+        </w:rPr>
+        <w:t xml:space="preserve"> Examples:</w:t>
+      </w:r>
+      <w:r>
+        <w:t xml:space="preserve"> "</w:t>
+      </w:r>
+      <w:r>
+        <w:t>CareerBound-SDD\01_Standards\Templates\Milestone_5_Algorithms\M5_Pseudocode_Examples.docx"</w:t>
+      </w:r>
+    </w:p>
+    <w:p>
+      <w:r>
+        <w:rPr>
+          <w:b/>
+          <w:bCs/>
+        </w:rPr>
+        <w:t>#3 Standards:</w:t>
+      </w:r>
+      <w:r>
+        <w:t xml:space="preserve"> </w:t>
+      </w:r>
+      <w:r>
+        <w:t>"CareerBound-SDD\01_Standards\Milestone_5_Algorithms\M5_Pseudocode_Algorithms_Standards.docx"</w:t>
+      </w:r>
+    </w:p>
+    <w:p>
+      <w:r>
+        <w:rPr>
+          <w:b/>
+          <w:bCs/>
+        </w:rPr>
+        <w:t>#4 Pseudocode Chapter:</w:t>
+      </w:r>
+      <w:r>
+        <w:t xml:space="preserve"> Software Design class textbook by H</w:t>
+      </w:r>
+      <w:r>
+        <w:t>elfrich</w:t>
+      </w:r>
+      <w:r>
+        <w:t xml:space="preserve">, Unit 0, </w:t>
+      </w:r>
+      <w:r>
+        <w:t>Chapter 0.2 Pseudocode</w:t>
+      </w:r>
+      <w:r>
+        <w:t xml:space="preserve"> (</w:t>
+      </w:r>
+      <w:hyperlink r:id="rId7" w:history="1">
+        <w:r>
+          <w:rPr>
+            <w:rStyle w:val="Hyperlink"/>
+          </w:rPr>
+          <w:t>https://byui.vitalsource.com/reader/books/9798319726032/pageid/46</w:t>
+        </w:r>
+      </w:hyperlink>
+      <w:r>
+        <w:t xml:space="preserve">) </w:t>
+      </w:r>
+    </w:p>
+    <w:p>
+      <w:r>
+        <w:rPr>
+          <w:b/>
+          <w:bCs/>
+          <w:noProof/>
+        </w:rPr>
+        <mc:AlternateContent>
+          <mc:Choice Requires="wps">
+            <w:drawing>
+              <wp:anchor distT="0" distB="0" distL="114300" distR="114300" simplePos="0" relativeHeight="251659264" behindDoc="0" locked="0" layoutInCell="1" allowOverlap="1" wp14:anchorId="31E6871F" wp14:editId="60B024BE">
+                <wp:simplePos x="0" y="0"/>
+                <wp:positionH relativeFrom="column">
+                  <wp:posOffset>4067175</wp:posOffset>
+                </wp:positionH>
+                <wp:positionV relativeFrom="paragraph">
+                  <wp:posOffset>14605</wp:posOffset>
+                </wp:positionV>
+                <wp:extent cx="0" cy="133350"/>
+                <wp:effectExtent l="76200" t="0" r="57150" b="57150"/>
+                <wp:wrapNone/>
+                <wp:docPr id="994414313" name="Straight Arrow Connector 1"/>
+                <wp:cNvGraphicFramePr/>
+                <a:graphic xmlns:a="http://schemas.openxmlformats.org/drawingml/2006/main">
+                  <a:graphicData uri="http://schemas.microsoft.com/office/word/2010/wordprocessingShape">
+                    <wps:wsp>
+                      <wps:cNvCnPr/>
+                      <wps:spPr>
+                        <a:xfrm>
+                          <a:off x="0" y="0"/>
+                          <a:ext cx="0" cy="133350"/>
+                        </a:xfrm>
+                        <a:prstGeom prst="straightConnector1">
+                          <a:avLst/>
+                        </a:prstGeom>
+                        <a:ln>
+                          <a:solidFill>
+                            <a:schemeClr val="tx1"/>
+                          </a:solidFill>
+                          <a:tailEnd type="triangle"/>
+                        </a:ln>
+                      </wps:spPr>
+                      <wps:style>
+                        <a:lnRef idx="1">
+                          <a:schemeClr val="accent1"/>
+                        </a:lnRef>
+                        <a:fillRef idx="0">
+                          <a:schemeClr val="accent1"/>
+                        </a:fillRef>
+                        <a:effectRef idx="0">
+                          <a:schemeClr val="accent1"/>
+                        </a:effectRef>
+                        <a:fontRef idx="minor">
+                          <a:schemeClr val="tx1"/>
+                        </a:fontRef>
+                      </wps:style>
+                      <wps:bodyPr/>
+                    </wps:wsp>
+                  </a:graphicData>
+                </a:graphic>
+              </wp:anchor>
+            </w:drawing>
+          </mc:Choice>
+          <mc:Fallback>
+            <w:pict>
+              <v:shapetype w14:anchorId="7DA537A1" id="_x0000_t32" coordsize="21600,21600" o:spt="32" o:oned="t" path="m,l21600,21600e" filled="f">
+                <v:path arrowok="t" fillok="f" o:connecttype="none"/>
+                <o:lock v:ext="edit" shapetype="t"/>
+              </v:shapetype>
+              <v:shape id="Straight Arrow Connector 1" o:spid="_x0000_s1026" type="#_x0000_t32" style="position:absolute;margin-left:320.25pt;margin-top:1.15pt;width:0;height:10.5pt;z-index:251659264;visibility:visible;mso-wrap-style:square;mso-wrap-distance-left:9pt;mso-wrap-distance-top:0;mso-wrap-distance-right:9pt;mso-wrap-distance-bottom:0;mso-position-horizontal:absolute;mso-position-horizontal-relative:text;mso-position-vertical:absolute;mso-position-vertical-relative:text" o:gfxdata="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" strokecolor="black [3213]" strokeweight=".5pt">
+                <v:stroke endarrow="block" joinstyle="miter"/>
+              </v:shape>
+            </w:pict>
+          </mc:Fallback>
+        </mc:AlternateContent>
+      </w:r>
+      <w:r>
+        <w:rPr>
+          <w:b/>
+          <w:bCs/>
+        </w:rPr>
+        <w:t>#5 Notes:</w:t>
+      </w:r>
+      <w:r>
+        <w:t xml:space="preserve"> Methods Pseudocode section directly below this</w:t>
+      </w:r>
+      <w:r>
+        <w:t xml:space="preserve"> </w:t>
+      </w:r>
+    </w:p>
+    <w:p>
+      <w:pPr>
+        <w:pStyle w:val="GitHubProcesses"/>
+        <w:rPr>
           <w:u w:val="none"/>
         </w:rPr>
       </w:pPr>
@@ -1188,7 +1804,6 @@
         <w:pStyle w:val="BestPractices"/>
       </w:pPr>
       <w:r>
-        <w:lastRenderedPageBreak/>
         <w:t>Rule 0.2.3 Indentations are used for loops, IF statements, and function membership</w:t>
       </w:r>
     </w:p>
@@ -1464,7 +2079,7 @@
                     <pic:cNvPicPr/>
                   </pic:nvPicPr>
                   <pic:blipFill rotWithShape="1">
-                    <a:blip r:embed="rId7"/>
+                    <a:blip r:embed="rId8"/>
                     <a:srcRect l="17120" t="14987" r="10792" b="22672"/>
                     <a:stretch>
                       <a:fillRect/>
@@ -1782,7 +2397,6 @@
         </w:tc>
       </w:tr>
     </w:tbl>
-    <w:p/>
     <w:p>
       <w:pPr>
         <w:pStyle w:val="GitHubProcesses"/>
@@ -1812,384 +2426,6 @@
           <w:szCs w:val="36"/>
         </w:rPr>
         <w:t xml:space="preserve"> Mobile Client</w:t>
-      </w:r>
-    </w:p>
-    <w:p>
-      <w:pPr>
-        <w:pStyle w:val="Sub-Info"/>
-      </w:pPr>
-      <w:r>
-        <w:t>Required List (15 Algorithms)</w:t>
-      </w:r>
-    </w:p>
-    <w:p>
-      <w:pPr>
-        <w:pStyle w:val="ListParagraph"/>
-        <w:numPr>
-          <w:ilvl w:val="0"/>
-          <w:numId w:val="1"/>
-        </w:numPr>
-      </w:pPr>
-      <w:r>
-        <w:t xml:space="preserve">1.2.1 &amp; 1.3.1-ALG </w:t>
-      </w:r>
-      <w:proofErr w:type="spellStart"/>
-      <w:proofErr w:type="gramStart"/>
-      <w:r>
-        <w:t>updateView</w:t>
-      </w:r>
-      <w:proofErr w:type="spellEnd"/>
-      <w:r>
-        <w:t>(</w:t>
-      </w:r>
-      <w:proofErr w:type="gramEnd"/>
-      <w:r>
-        <w:t>) Algorithm</w:t>
-      </w:r>
-    </w:p>
-    <w:p>
-      <w:pPr>
-        <w:pStyle w:val="ListParagraph"/>
-        <w:numPr>
-          <w:ilvl w:val="0"/>
-          <w:numId w:val="1"/>
-        </w:numPr>
-      </w:pPr>
-      <w:r>
-        <w:t xml:space="preserve">1.2.1 &amp; 1.3.1-ALG </w:t>
-      </w:r>
-      <w:proofErr w:type="spellStart"/>
-      <w:proofErr w:type="gramStart"/>
-      <w:r>
-        <w:t>selectNavigationTarget</w:t>
-      </w:r>
-      <w:proofErr w:type="spellEnd"/>
-      <w:r>
-        <w:t>(</w:t>
-      </w:r>
-      <w:proofErr w:type="gramEnd"/>
-      <w:r>
-        <w:t>) Algorithm</w:t>
-      </w:r>
-    </w:p>
-    <w:p>
-      <w:pPr>
-        <w:pStyle w:val="ListParagraph"/>
-        <w:numPr>
-          <w:ilvl w:val="0"/>
-          <w:numId w:val="1"/>
-        </w:numPr>
-      </w:pPr>
-      <w:r>
-        <w:t xml:space="preserve">1.2.2 &amp; 1.3.2-ALG </w:t>
-      </w:r>
-      <w:proofErr w:type="spellStart"/>
-      <w:proofErr w:type="gramStart"/>
-      <w:r>
-        <w:t>onInit</w:t>
-      </w:r>
-      <w:proofErr w:type="spellEnd"/>
-      <w:r>
-        <w:t>(</w:t>
-      </w:r>
-      <w:proofErr w:type="gramEnd"/>
-      <w:r>
-        <w:t>) Algorithm</w:t>
-      </w:r>
-    </w:p>
-    <w:p>
-      <w:pPr>
-        <w:pStyle w:val="ListParagraph"/>
-        <w:numPr>
-          <w:ilvl w:val="0"/>
-          <w:numId w:val="1"/>
-        </w:numPr>
-      </w:pPr>
-      <w:r>
-        <w:t xml:space="preserve">1.2.2 &amp; 1.3.2-ALG </w:t>
-      </w:r>
-      <w:proofErr w:type="spellStart"/>
-      <w:proofErr w:type="gramStart"/>
-      <w:r>
-        <w:t>renderSelectedView</w:t>
-      </w:r>
-      <w:proofErr w:type="spellEnd"/>
-      <w:r>
-        <w:t>(</w:t>
-      </w:r>
-      <w:proofErr w:type="gramEnd"/>
-      <w:r>
-        <w:t>) Algorithm</w:t>
-      </w:r>
-    </w:p>
-    <w:p>
-      <w:pPr>
-        <w:pStyle w:val="ListParagraph"/>
-        <w:numPr>
-          <w:ilvl w:val="0"/>
-          <w:numId w:val="1"/>
-        </w:numPr>
-      </w:pPr>
-      <w:r>
-        <w:t xml:space="preserve">1.2.2 &amp; 1.3.2-ALG </w:t>
-      </w:r>
-      <w:proofErr w:type="gramStart"/>
-      <w:r>
-        <w:t>render(</w:t>
-      </w:r>
-      <w:proofErr w:type="gramEnd"/>
-      <w:r>
-        <w:t>) Algorithm</w:t>
-      </w:r>
-    </w:p>
-    <w:p>
-      <w:pPr>
-        <w:pStyle w:val="ListParagraph"/>
-        <w:numPr>
-          <w:ilvl w:val="0"/>
-          <w:numId w:val="1"/>
-        </w:numPr>
-      </w:pPr>
-      <w:r>
-        <w:t xml:space="preserve">1.2.3 &amp; 1.3.3-ALG </w:t>
-      </w:r>
-      <w:proofErr w:type="spellStart"/>
-      <w:proofErr w:type="gramStart"/>
-      <w:r>
-        <w:t>submitForm</w:t>
-      </w:r>
-      <w:proofErr w:type="spellEnd"/>
-      <w:r>
-        <w:t>(</w:t>
-      </w:r>
-      <w:proofErr w:type="gramEnd"/>
-      <w:r>
-        <w:t>) Algorithm</w:t>
-      </w:r>
-    </w:p>
-    <w:p>
-      <w:pPr>
-        <w:pStyle w:val="ListParagraph"/>
-        <w:numPr>
-          <w:ilvl w:val="0"/>
-          <w:numId w:val="1"/>
-        </w:numPr>
-      </w:pPr>
-      <w:r>
-        <w:t xml:space="preserve">1.2.3 &amp; 1.3.3-ALG </w:t>
-      </w:r>
-      <w:proofErr w:type="spellStart"/>
-      <w:proofErr w:type="gramStart"/>
-      <w:r>
-        <w:t>validateInputs</w:t>
-      </w:r>
-      <w:proofErr w:type="spellEnd"/>
-      <w:r>
-        <w:t>(</w:t>
-      </w:r>
-      <w:proofErr w:type="gramEnd"/>
-      <w:r>
-        <w:t>) Algorithm</w:t>
-      </w:r>
-    </w:p>
-    <w:p>
-      <w:pPr>
-        <w:pStyle w:val="ListParagraph"/>
-        <w:numPr>
-          <w:ilvl w:val="0"/>
-          <w:numId w:val="1"/>
-        </w:numPr>
-      </w:pPr>
-      <w:r>
-        <w:t xml:space="preserve">1.2.3 &amp; 1.3.3-ALG </w:t>
-      </w:r>
-      <w:proofErr w:type="spellStart"/>
-      <w:proofErr w:type="gramStart"/>
-      <w:r>
-        <w:t>checkRequiredFields</w:t>
-      </w:r>
-      <w:proofErr w:type="spellEnd"/>
-      <w:r>
-        <w:t>(</w:t>
-      </w:r>
-      <w:proofErr w:type="gramEnd"/>
-      <w:r>
-        <w:t>) Algorithm</w:t>
-      </w:r>
-    </w:p>
-    <w:p>
-      <w:pPr>
-        <w:pStyle w:val="ListParagraph"/>
-        <w:numPr>
-          <w:ilvl w:val="0"/>
-          <w:numId w:val="1"/>
-        </w:numPr>
-      </w:pPr>
-      <w:r>
-        <w:t xml:space="preserve">1.2.3 &amp; 1.3.3-ALG </w:t>
-      </w:r>
-      <w:proofErr w:type="spellStart"/>
-      <w:proofErr w:type="gramStart"/>
-      <w:r>
-        <w:t>buildPayload</w:t>
-      </w:r>
-      <w:proofErr w:type="spellEnd"/>
-      <w:r>
-        <w:t>(</w:t>
-      </w:r>
-      <w:proofErr w:type="gramEnd"/>
-      <w:r>
-        <w:t>) Algorithm</w:t>
-      </w:r>
-    </w:p>
-    <w:p>
-      <w:pPr>
-        <w:pStyle w:val="ListParagraph"/>
-        <w:numPr>
-          <w:ilvl w:val="0"/>
-          <w:numId w:val="1"/>
-        </w:numPr>
-      </w:pPr>
-      <w:r>
-        <w:t xml:space="preserve">1.2.3 &amp; 1.3.3-ALG </w:t>
-      </w:r>
-      <w:proofErr w:type="spellStart"/>
-      <w:proofErr w:type="gramStart"/>
-      <w:r>
-        <w:t>displayValidationFeedback</w:t>
-      </w:r>
-      <w:proofErr w:type="spellEnd"/>
-      <w:r>
-        <w:t>(</w:t>
-      </w:r>
-      <w:proofErr w:type="gramEnd"/>
-      <w:r>
-        <w:t>) Algorithm</w:t>
-      </w:r>
-    </w:p>
-    <w:p>
-      <w:pPr>
-        <w:pStyle w:val="ListParagraph"/>
-        <w:numPr>
-          <w:ilvl w:val="0"/>
-          <w:numId w:val="1"/>
-        </w:numPr>
-      </w:pPr>
-      <w:r>
-        <w:t xml:space="preserve">1.2.4 &amp; 1.3.4-ALG </w:t>
-      </w:r>
-      <w:proofErr w:type="spellStart"/>
-      <w:proofErr w:type="gramStart"/>
-      <w:r>
-        <w:t>updateClientState</w:t>
-      </w:r>
-      <w:proofErr w:type="spellEnd"/>
-      <w:r>
-        <w:t>(</w:t>
-      </w:r>
-      <w:proofErr w:type="gramEnd"/>
-      <w:r>
-        <w:t>) Algorithm</w:t>
-      </w:r>
-    </w:p>
-    <w:p>
-      <w:pPr>
-        <w:pStyle w:val="ListParagraph"/>
-        <w:numPr>
-          <w:ilvl w:val="0"/>
-          <w:numId w:val="1"/>
-        </w:numPr>
-      </w:pPr>
-      <w:r>
-        <w:t xml:space="preserve">1.2.4 &amp; 1.3.4-ALG </w:t>
-      </w:r>
-      <w:proofErr w:type="spellStart"/>
-      <w:proofErr w:type="gramStart"/>
-      <w:r>
-        <w:t>DynamicUI</w:t>
-      </w:r>
-      <w:proofErr w:type="spellEnd"/>
-      <w:r>
-        <w:t>(</w:t>
-      </w:r>
-      <w:proofErr w:type="gramEnd"/>
-      <w:r>
-        <w:t>) Algorithm</w:t>
-      </w:r>
-    </w:p>
-    <w:p>
-      <w:pPr>
-        <w:pStyle w:val="ListParagraph"/>
-        <w:numPr>
-          <w:ilvl w:val="0"/>
-          <w:numId w:val="1"/>
-        </w:numPr>
-      </w:pPr>
-      <w:r>
-        <w:t xml:space="preserve">1.2.4 &amp; 1.3.4-ALG </w:t>
-      </w:r>
-      <w:proofErr w:type="spellStart"/>
-      <w:proofErr w:type="gramStart"/>
-      <w:r>
-        <w:t>updateAccessibility</w:t>
-      </w:r>
-      <w:proofErr w:type="spellEnd"/>
-      <w:r>
-        <w:t>(</w:t>
-      </w:r>
-      <w:proofErr w:type="gramEnd"/>
-      <w:r>
-        <w:t>) Algorithm</w:t>
-      </w:r>
-    </w:p>
-    <w:p>
-      <w:pPr>
-        <w:pStyle w:val="ListParagraph"/>
-        <w:numPr>
-          <w:ilvl w:val="0"/>
-          <w:numId w:val="1"/>
-        </w:numPr>
-      </w:pPr>
-      <w:r>
-        <w:t xml:space="preserve">1.2.5 &amp; 1.3.5-ALG </w:t>
-      </w:r>
-      <w:proofErr w:type="spellStart"/>
-      <w:proofErr w:type="gramStart"/>
-      <w:r>
-        <w:t>sendAPIRequest</w:t>
-      </w:r>
-      <w:proofErr w:type="spellEnd"/>
-      <w:r>
-        <w:t>(</w:t>
-      </w:r>
-      <w:proofErr w:type="gramEnd"/>
-      <w:r>
-        <w:t>) Algorithm</w:t>
-      </w:r>
-    </w:p>
-    <w:p>
-      <w:pPr>
-        <w:pStyle w:val="ListParagraph"/>
-        <w:numPr>
-          <w:ilvl w:val="0"/>
-          <w:numId w:val="1"/>
-        </w:numPr>
-      </w:pPr>
-      <w:r>
-        <w:t xml:space="preserve">1.2.5 &amp; 1.3.5-ALG </w:t>
-      </w:r>
-      <w:proofErr w:type="spellStart"/>
-      <w:proofErr w:type="gramStart"/>
-      <w:r>
-        <w:t>ResponseParser</w:t>
-      </w:r>
-      <w:proofErr w:type="spellEnd"/>
-      <w:r>
-        <w:t>(</w:t>
-      </w:r>
-      <w:proofErr w:type="gramEnd"/>
-      <w:r>
-        <w:t>) Algorithm</w:t>
       </w:r>
     </w:p>
     <w:p>
@@ -2198,6 +2434,12 @@
       </w:pPr>
       <w:r>
         <w:t>Sources</w:t>
+      </w:r>
+      <w:r>
+        <w:t xml:space="preserve"> for </w:t>
+      </w:r>
+      <w:r>
+        <w:t>Required List (15 Algorithms)</w:t>
       </w:r>
     </w:p>
     <w:p>
@@ -3308,7 +3550,6 @@
                 <w:szCs w:val="20"/>
                 <w:lang w:eastAsia="en-US"/>
               </w:rPr>
-              <w:lastRenderedPageBreak/>
               <w:t>BackgroundHandler</w:t>
             </w:r>
             <w:proofErr w:type="spellEnd"/>
@@ -4055,6 +4296,7 @@
                 <w:highlight w:val="yellow"/>
                 <w:lang w:eastAsia="en-US"/>
               </w:rPr>
+              <w:lastRenderedPageBreak/>
               <w:t>onInit</w:t>
             </w:r>
             <w:proofErr w:type="spellEnd"/>
@@ -5540,7 +5782,6 @@
                 <w:szCs w:val="20"/>
                 <w:lang w:eastAsia="en-US"/>
               </w:rPr>
-              <w:lastRenderedPageBreak/>
               <w:t>checkOrientation</w:t>
             </w:r>
             <w:proofErr w:type="spellEnd"/>
@@ -6368,6 +6609,7 @@
                 <w:szCs w:val="20"/>
                 <w:lang w:eastAsia="en-US"/>
               </w:rPr>
+              <w:lastRenderedPageBreak/>
               <w:t>cookieManager</w:t>
             </w:r>
             <w:proofErr w:type="spellEnd"/>
@@ -6585,7 +6827,7 @@
     </w:p>
     <w:p/>
     <w:sectPr>
-      <w:headerReference w:type="default" r:id="rId8"/>
+      <w:headerReference w:type="default" r:id="rId9"/>
       <w:pgSz w:w="12240" w:h="15840"/>
       <w:pgMar w:top="1440" w:right="1440" w:bottom="1440" w:left="1440" w:header="720" w:footer="720" w:gutter="0"/>
       <w:cols w:space="720"/>
@@ -8862,6 +9104,29 @@
       <w:lang w:eastAsia="ja-JP"/>
     </w:rPr>
   </w:style>
+  <w:style w:type="character" w:styleId="Hyperlink">
+    <w:name w:val="Hyperlink"/>
+    <w:basedOn w:val="DefaultParagraphFont"/>
+    <w:uiPriority w:val="99"/>
+    <w:unhideWhenUsed/>
+    <w:rsid w:val="00D327C6"/>
+    <w:rPr>
+      <w:color w:val="467886" w:themeColor="hyperlink"/>
+      <w:u w:val="single"/>
+    </w:rPr>
+  </w:style>
+  <w:style w:type="character" w:styleId="UnresolvedMention">
+    <w:name w:val="Unresolved Mention"/>
+    <w:basedOn w:val="DefaultParagraphFont"/>
+    <w:uiPriority w:val="99"/>
+    <w:semiHidden/>
+    <w:unhideWhenUsed/>
+    <w:rsid w:val="00D327C6"/>
+    <w:rPr>
+      <w:color w:val="605E5C"/>
+      <w:shd w:val="clear" w:color="auto" w:fill="E1DFDD"/>
+    </w:rPr>
+  </w:style>
 </w:styles>
 </file>
 

</xml_diff>